<commit_message>
docs: chapter five end
</commit_message>
<xml_diff>
--- a/documents/report/report1.docx
+++ b/documents/report/report1.docx
@@ -9941,8 +9941,1132 @@
           <w:szCs w:val="24"/>
         </w:rPr>
       </w:r>
+    </w:p>
+    <w:p>
+      <w:pPr>
+        <w:pStyle w:val="Normal"/>
+        <w:bidi w:val="0"/>
+        <w:spacing w:lineRule="auto" w:line="360" w:before="57" w:after="57"/>
+        <w:jc w:val="start"/>
+        <w:rPr>
+          <w:rFonts w:ascii="Times New Roman" w:hAnsi="Times New Roman"/>
+          <w:b/>
+          <w:bCs/>
+          <w:sz w:val="24"/>
+          <w:szCs w:val="24"/>
+        </w:rPr>
+      </w:pPr>
+      <w:r>
+        <w:rPr>
+          <w:rFonts w:ascii="Times New Roman" w:hAnsi="Times New Roman"/>
+          <w:b/>
+          <w:bCs/>
+          <w:sz w:val="24"/>
+          <w:szCs w:val="24"/>
+        </w:rPr>
+        <w:t>4.2 Description of Algorithm</w:t>
+      </w:r>
+    </w:p>
+    <w:p>
+      <w:pPr>
+        <w:pStyle w:val="Heading4"/>
+        <w:bidi w:val="0"/>
+        <w:spacing w:lineRule="auto" w:line="360" w:before="57" w:after="57"/>
+        <w:jc w:val="both"/>
+        <w:rPr>
+          <w:rFonts w:ascii="Times New Roman" w:hAnsi="Times New Roman"/>
+          <w:b/>
+          <w:bCs/>
+          <w:sz w:val="24"/>
+          <w:szCs w:val="24"/>
+        </w:rPr>
+      </w:pPr>
+      <w:r>
+        <w:rPr>
+          <w:rFonts w:ascii="Times New Roman" w:hAnsi="Times New Roman"/>
+          <w:b/>
+          <w:bCs/>
+          <w:sz w:val="24"/>
+          <w:szCs w:val="24"/>
+        </w:rPr>
+        <w:t>4.2.1 Location Distance Algorithm (Nearest Futsal Recommendation)</w:t>
+      </w:r>
+    </w:p>
+    <w:p>
+      <w:pPr>
+        <w:pStyle w:val="BodyText"/>
+        <w:bidi w:val="0"/>
+        <w:spacing w:lineRule="auto" w:line="360"/>
+        <w:jc w:val="both"/>
+        <w:rPr/>
+      </w:pPr>
+      <w:r>
+        <w:rPr/>
+        <w:t>The Location Distance Algorithm is used to recommend nearby futsal centers to users based on their current geographical position. The system calculates the real-world distance between the user's location and each registered futsal center using the Haversine formula, which accurately computes the great-circle distance between two points on the surface of the Earth given their latitude and longitude coordinates.</w:t>
+      </w:r>
+    </w:p>
+    <w:p>
+      <w:pPr>
+        <w:pStyle w:val="BodyText"/>
+        <w:bidi w:val="0"/>
+        <w:spacing w:lineRule="auto" w:line="360"/>
+        <w:jc w:val="both"/>
+        <w:rPr/>
+      </w:pPr>
+      <w:r>
+        <w:rPr/>
+        <w:t>The working flow of the algorithm can be described as follows:</w:t>
+      </w:r>
+    </w:p>
+    <w:p>
+      <w:pPr>
+        <w:pStyle w:val="BodyText"/>
+        <w:bidi w:val="0"/>
+        <w:spacing w:lineRule="auto" w:line="360"/>
+        <w:jc w:val="both"/>
+        <w:rPr/>
+      </w:pPr>
+      <w:r>
+        <w:rPr>
+          <w:rStyle w:val="Strong"/>
+        </w:rPr>
+        <w:t>User Location Detection:</w:t>
+      </w:r>
+      <w:r>
+        <w:rPr/>
+        <w:t xml:space="preserve"> The system reads the user's current latitude and longitude coordinates, either through browser geolocation or a manually entered location search. </w:t>
+      </w:r>
+    </w:p>
+    <w:p>
+      <w:pPr>
+        <w:pStyle w:val="BodyText"/>
+        <w:bidi w:val="0"/>
+        <w:spacing w:lineRule="auto" w:line="360"/>
+        <w:jc w:val="both"/>
+        <w:rPr/>
+      </w:pPr>
+      <w:r>
+        <w:rPr>
+          <w:rStyle w:val="Strong"/>
+        </w:rPr>
+        <w:t>Futsal Center Coordinates Retrieval:</w:t>
+      </w:r>
+      <w:r>
+        <w:rPr/>
+        <w:t xml:space="preserve"> The system retrieves the registered latitude and longitude coordinates of all active futsal centers stored in the database. </w:t>
+      </w:r>
+    </w:p>
+    <w:p>
+      <w:pPr>
+        <w:pStyle w:val="BodyText"/>
+        <w:bidi w:val="0"/>
+        <w:spacing w:lineRule="auto" w:line="360"/>
+        <w:jc w:val="both"/>
+        <w:rPr/>
+      </w:pPr>
+      <w:r>
+        <w:rPr>
+          <w:rStyle w:val="Strong"/>
+        </w:rPr>
+        <w:t>Distance Calculation:</w:t>
+      </w:r>
+      <w:r>
+        <w:rPr/>
+        <w:t xml:space="preserve"> For each futsal center, the system computes the geographical distance from the user's location using the Haversine formula. </w:t>
+      </w:r>
+    </w:p>
+    <w:p>
+      <w:pPr>
+        <w:pStyle w:val="BodyText"/>
+        <w:bidi w:val="0"/>
+        <w:spacing w:lineRule="auto" w:line="360"/>
+        <w:jc w:val="both"/>
+        <w:rPr/>
+      </w:pPr>
+      <w:r>
+        <w:rPr>
+          <w:rStyle w:val="Strong"/>
+        </w:rPr>
+        <w:t>Sorting and Ranking:</w:t>
+      </w:r>
+      <w:r>
+        <w:rPr/>
+        <w:t xml:space="preserve"> All futsal centers are sorted in ascending order of calculated distance, placing the nearest futsal centers at the top of the recommendation list. </w:t>
+      </w:r>
+    </w:p>
+    <w:p>
+      <w:pPr>
+        <w:pStyle w:val="BodyText"/>
+        <w:bidi w:val="0"/>
+        <w:spacing w:lineRule="auto" w:line="360"/>
+        <w:jc w:val="both"/>
+        <w:rPr/>
+      </w:pPr>
+      <w:r>
+        <w:rPr>
+          <w:rStyle w:val="Strong"/>
+        </w:rPr>
+        <w:t>Result Display:</w:t>
+      </w:r>
+      <w:r>
+        <w:rPr/>
+        <w:t xml:space="preserve"> The sorted list of nearby futsal centers is returned to the user interface, where courts are displayed with their calculated distance from the user's current location, allowing users to make informed decisions based on proximity. </w:t>
+      </w:r>
+    </w:p>
+    <w:p>
+      <w:pPr>
+        <w:pStyle w:val="BodyText"/>
+        <w:bidi w:val="0"/>
+        <w:spacing w:lineRule="auto" w:line="360"/>
+        <w:jc w:val="both"/>
+        <w:rPr/>
+      </w:pPr>
+      <w:r>
+        <w:rPr/>
+        <w:t>Mathematical Representation (Haversine Formula):</w:t>
+      </w:r>
+    </w:p>
+    <w:p>
+      <w:pPr>
+        <w:pStyle w:val="BodyText"/>
+        <w:bidi w:val="0"/>
+        <w:spacing w:lineRule="auto" w:line="360"/>
+        <w:jc w:val="both"/>
+        <w:rPr/>
+      </w:pPr>
+      <w:r>
+        <w:rPr>
+          <w:rStyle w:val="SourceText"/>
+          <w:rFonts w:ascii="var font-mono" w:hAnsi="var font-mono"/>
+          <w:color w:val="000000"/>
+          <w:shd w:fill="auto" w:val="clear"/>
+        </w:rPr>
+        <w:t>d = 2r × arcsin( √( sin²(Δφ/2) + cos(φ₁) × cos(φ₂) × sin²(Δλ/2) ) )</w:t>
+      </w:r>
+    </w:p>
+    <w:p>
+      <w:pPr>
+        <w:pStyle w:val="BodyText"/>
+        <w:bidi w:val="0"/>
+        <w:spacing w:lineRule="auto" w:line="360"/>
+        <w:jc w:val="both"/>
+        <w:rPr/>
+      </w:pPr>
+      <w:r>
+        <w:rPr/>
+        <w:t>Where:</w:t>
+      </w:r>
+    </w:p>
+    <w:p>
+      <w:pPr>
+        <w:pStyle w:val="BodyText"/>
+        <w:numPr>
+          <w:ilvl w:val="0"/>
+          <w:numId w:val="0"/>
+        </w:numPr>
+        <w:bidi w:val="0"/>
+        <w:spacing w:lineRule="auto" w:line="360" w:before="0" w:after="0"/>
+        <w:ind w:hanging="0" w:start="0"/>
+        <w:jc w:val="both"/>
+        <w:rPr/>
+      </w:pPr>
+      <w:r>
+        <w:rPr>
+          <w:rStyle w:val="Strong"/>
+          <w:b w:val="false"/>
+          <w:bCs w:val="false"/>
+        </w:rPr>
+        <w:t>d</w:t>
+      </w:r>
+      <w:r>
+        <w:rPr>
+          <w:b w:val="false"/>
+          <w:bCs w:val="false"/>
+        </w:rPr>
+        <w:t xml:space="preserve"> = Distance between the user and the futsal center </w:t>
+      </w:r>
+    </w:p>
+    <w:p>
+      <w:pPr>
+        <w:pStyle w:val="BodyText"/>
+        <w:numPr>
+          <w:ilvl w:val="0"/>
+          <w:numId w:val="0"/>
+        </w:numPr>
+        <w:bidi w:val="0"/>
+        <w:spacing w:lineRule="auto" w:line="360" w:before="0" w:after="0"/>
+        <w:ind w:hanging="0" w:start="0"/>
+        <w:jc w:val="both"/>
+        <w:rPr/>
+      </w:pPr>
+      <w:r>
+        <w:rPr>
+          <w:rStyle w:val="Strong"/>
+          <w:b w:val="false"/>
+          <w:bCs w:val="false"/>
+        </w:rPr>
+        <w:t>r</w:t>
+      </w:r>
+      <w:r>
+        <w:rPr>
+          <w:b w:val="false"/>
+          <w:bCs w:val="false"/>
+        </w:rPr>
+        <w:t xml:space="preserve"> = Radius of the Earth (6371 km) </w:t>
+      </w:r>
+    </w:p>
+    <w:p>
+      <w:pPr>
+        <w:pStyle w:val="BodyText"/>
+        <w:numPr>
+          <w:ilvl w:val="0"/>
+          <w:numId w:val="0"/>
+        </w:numPr>
+        <w:bidi w:val="0"/>
+        <w:spacing w:lineRule="auto" w:line="360" w:before="0" w:after="0"/>
+        <w:ind w:hanging="0" w:start="0"/>
+        <w:jc w:val="both"/>
+        <w:rPr/>
+      </w:pPr>
+      <w:r>
+        <w:rPr>
+          <w:rStyle w:val="Strong"/>
+          <w:b w:val="false"/>
+          <w:bCs w:val="false"/>
+        </w:rPr>
+        <w:t>φ₁</w:t>
+      </w:r>
+      <w:r>
+        <w:rPr>
+          <w:b w:val="false"/>
+          <w:bCs w:val="false"/>
+        </w:rPr>
+        <w:t xml:space="preserve"> = Latitude of the user (in radians) </w:t>
+      </w:r>
+    </w:p>
+    <w:p>
+      <w:pPr>
+        <w:pStyle w:val="BodyText"/>
+        <w:numPr>
+          <w:ilvl w:val="0"/>
+          <w:numId w:val="0"/>
+        </w:numPr>
+        <w:bidi w:val="0"/>
+        <w:spacing w:lineRule="auto" w:line="360" w:before="0" w:after="0"/>
+        <w:ind w:hanging="0" w:start="0"/>
+        <w:jc w:val="both"/>
+        <w:rPr/>
+      </w:pPr>
+      <w:r>
+        <w:rPr>
+          <w:rStyle w:val="Strong"/>
+          <w:b w:val="false"/>
+          <w:bCs w:val="false"/>
+        </w:rPr>
+        <w:t>φ₂</w:t>
+      </w:r>
+      <w:r>
+        <w:rPr>
+          <w:b w:val="false"/>
+          <w:bCs w:val="false"/>
+        </w:rPr>
+        <w:t xml:space="preserve"> = Latitude of the futsal center (in radians) </w:t>
+      </w:r>
+    </w:p>
+    <w:p>
+      <w:pPr>
+        <w:pStyle w:val="BodyText"/>
+        <w:numPr>
+          <w:ilvl w:val="0"/>
+          <w:numId w:val="0"/>
+        </w:numPr>
+        <w:bidi w:val="0"/>
+        <w:spacing w:lineRule="auto" w:line="360" w:before="0" w:after="0"/>
+        <w:ind w:hanging="0" w:start="0"/>
+        <w:jc w:val="both"/>
+        <w:rPr/>
+      </w:pPr>
+      <w:r>
+        <w:rPr>
+          <w:rStyle w:val="Strong"/>
+          <w:b w:val="false"/>
+          <w:bCs w:val="false"/>
+        </w:rPr>
+        <w:t>λ₁</w:t>
+      </w:r>
+      <w:r>
+        <w:rPr>
+          <w:b w:val="false"/>
+          <w:bCs w:val="false"/>
+        </w:rPr>
+        <w:t xml:space="preserve"> = Longitude of the user (in radians) </w:t>
+      </w:r>
+    </w:p>
+    <w:p>
+      <w:pPr>
+        <w:pStyle w:val="BodyText"/>
+        <w:numPr>
+          <w:ilvl w:val="0"/>
+          <w:numId w:val="0"/>
+        </w:numPr>
+        <w:bidi w:val="0"/>
+        <w:spacing w:lineRule="auto" w:line="360" w:before="0" w:after="0"/>
+        <w:ind w:hanging="0" w:start="0"/>
+        <w:jc w:val="both"/>
+        <w:rPr/>
+      </w:pPr>
+      <w:r>
+        <w:rPr>
+          <w:rStyle w:val="Strong"/>
+          <w:b w:val="false"/>
+          <w:bCs w:val="false"/>
+        </w:rPr>
+        <w:t>λ₂</w:t>
+      </w:r>
+      <w:r>
+        <w:rPr>
+          <w:b w:val="false"/>
+          <w:bCs w:val="false"/>
+        </w:rPr>
+        <w:t xml:space="preserve"> = Longitude of the futsal center (in radians) </w:t>
+      </w:r>
+    </w:p>
+    <w:p>
+      <w:pPr>
+        <w:pStyle w:val="BodyText"/>
+        <w:numPr>
+          <w:ilvl w:val="0"/>
+          <w:numId w:val="0"/>
+        </w:numPr>
+        <w:bidi w:val="0"/>
+        <w:spacing w:lineRule="auto" w:line="360" w:before="0" w:after="0"/>
+        <w:ind w:hanging="0" w:start="0"/>
+        <w:jc w:val="both"/>
+        <w:rPr/>
+      </w:pPr>
+      <w:r>
+        <w:rPr>
+          <w:rStyle w:val="Strong"/>
+          <w:b w:val="false"/>
+          <w:bCs w:val="false"/>
+        </w:rPr>
+        <w:t>Δφ</w:t>
+      </w:r>
+      <w:r>
+        <w:rPr>
+          <w:b w:val="false"/>
+          <w:bCs w:val="false"/>
+        </w:rPr>
+        <w:t xml:space="preserve"> = φ₂ − φ₁ </w:t>
+      </w:r>
+    </w:p>
+    <w:p>
+      <w:pPr>
+        <w:pStyle w:val="BodyText"/>
+        <w:numPr>
+          <w:ilvl w:val="0"/>
+          <w:numId w:val="0"/>
+        </w:numPr>
+        <w:bidi w:val="0"/>
+        <w:spacing w:lineRule="auto" w:line="360"/>
+        <w:ind w:hanging="0" w:start="0"/>
+        <w:jc w:val="both"/>
+        <w:rPr/>
+      </w:pPr>
+      <w:r>
+        <w:rPr>
+          <w:rStyle w:val="Strong"/>
+          <w:b w:val="false"/>
+          <w:bCs w:val="false"/>
+        </w:rPr>
+        <w:t>Δλ</w:t>
+      </w:r>
+      <w:r>
+        <w:rPr>
+          <w:b w:val="false"/>
+          <w:bCs w:val="false"/>
+        </w:rPr>
+        <w:t xml:space="preserve"> = λ₂ − λ₁ </w:t>
+      </w:r>
+    </w:p>
+    <w:p>
+      <w:pPr>
+        <w:pStyle w:val="BodyText"/>
+        <w:bidi w:val="0"/>
+        <w:spacing w:lineRule="auto" w:line="360"/>
+        <w:jc w:val="both"/>
+        <w:rPr/>
+      </w:pPr>
+      <w:r>
+        <w:rPr/>
+        <w:t xml:space="preserve">By employing this algorithm, the </w:t>
+      </w:r>
+      <w:r>
+        <w:rPr/>
+        <w:t>futsal bookings and management</w:t>
+      </w:r>
+      <w:r>
+        <w:rPr/>
+        <w:t xml:space="preserve"> platform ensures that users are always presented with the most geographically relevant futsal centers first, reducing search effort and improving the overall booking experience for players across different locations in Nepal.</w:t>
+      </w:r>
+    </w:p>
+    <w:p>
+      <w:pPr>
+        <w:pStyle w:val="Heading4"/>
+        <w:bidi w:val="0"/>
+        <w:spacing w:lineRule="auto" w:line="360" w:before="57" w:after="57"/>
+        <w:jc w:val="start"/>
+        <w:rPr>
+          <w:rFonts w:ascii="Times New Roman" w:hAnsi="Times New Roman"/>
+          <w:b/>
+          <w:bCs/>
+          <w:sz w:val="24"/>
+          <w:szCs w:val="24"/>
+        </w:rPr>
+      </w:pPr>
+      <w:r>
+        <w:rPr>
+          <w:rFonts w:ascii="Times New Roman" w:hAnsi="Times New Roman"/>
+          <w:b/>
+          <w:bCs/>
+          <w:sz w:val="24"/>
+          <w:szCs w:val="24"/>
+        </w:rPr>
+        <w:t>4.2.2 Logistic Regression Algorithm (Sentiment Classification)</w:t>
+      </w:r>
+    </w:p>
+    <w:p>
+      <w:pPr>
+        <w:pStyle w:val="BodyText"/>
+        <w:bidi w:val="0"/>
+        <w:spacing w:lineRule="auto" w:line="360"/>
+        <w:jc w:val="start"/>
+        <w:rPr/>
+      </w:pPr>
+      <w:r>
+        <w:rPr/>
+        <w:t>The Logistic Regression algorithm is used as a supervised machine learning classifier in the AllFutsal system to automatically determine the sentiment of user-submitted reviews. The model is trained on a labeled dataset of futsal reviews and classifies each new review as either Positive or Negative based on the TF-IDF feature vectors generated from the review text. Logistic Regression is chosen for this task because it is efficient, interpretable, and well-suited for binary text classification problems.</w:t>
+      </w:r>
+    </w:p>
+    <w:p>
+      <w:pPr>
+        <w:pStyle w:val="BodyText"/>
+        <w:bidi w:val="0"/>
+        <w:spacing w:lineRule="auto" w:line="360"/>
+        <w:jc w:val="start"/>
+        <w:rPr/>
+      </w:pPr>
+      <w:r>
+        <w:rPr/>
+        <w:t>The working flow of the algorithm can be described as follows:</w:t>
+      </w:r>
+    </w:p>
+    <w:p>
+      <w:pPr>
+        <w:pStyle w:val="BodyText"/>
+        <w:bidi w:val="0"/>
+        <w:spacing w:lineRule="auto" w:line="360"/>
+        <w:jc w:val="start"/>
+        <w:rPr/>
+      </w:pPr>
+      <w:r>
+        <w:rPr>
+          <w:rStyle w:val="Strong"/>
+        </w:rPr>
+        <w:t>Feature Input:</w:t>
+      </w:r>
+      <w:r>
+        <w:rPr/>
+        <w:t xml:space="preserve"> The TF-IDF feature vectors generated from preprocessed user reviews are passed as input to the trained Logistic Regression model.</w:t>
+      </w:r>
+    </w:p>
+    <w:p>
+      <w:pPr>
+        <w:pStyle w:val="BodyText"/>
+        <w:bidi w:val="0"/>
+        <w:spacing w:lineRule="auto" w:line="360"/>
+        <w:jc w:val="start"/>
+        <w:rPr/>
+      </w:pPr>
+      <w:r>
+        <w:rPr>
+          <w:rStyle w:val="Strong"/>
+        </w:rPr>
+        <w:t>Model Training:</w:t>
+      </w:r>
+      <w:r>
+        <w:rPr/>
+        <w:t xml:space="preserve"> The model is trained on the synthetic futsal review dataset containing 1000 records with labeled sentiment values, learning the relationship between TF-IDF features and sentiment outcomes. </w:t>
+      </w:r>
+    </w:p>
+    <w:p>
+      <w:pPr>
+        <w:pStyle w:val="BodyText"/>
+        <w:bidi w:val="0"/>
+        <w:spacing w:lineRule="auto" w:line="360"/>
+        <w:jc w:val="start"/>
+        <w:rPr/>
+      </w:pPr>
+      <w:r>
+        <w:rPr>
+          <w:rStyle w:val="Strong"/>
+        </w:rPr>
+        <w:t>Probability Score Computation:</w:t>
+      </w:r>
+      <w:r>
+        <w:rPr/>
+        <w:t xml:space="preserve"> For each new review, the model computes a probability score between 0 and 1 representing the likelihood that the review belongs to the Positive sentiment class. </w:t>
+      </w:r>
+    </w:p>
+    <w:p>
+      <w:pPr>
+        <w:pStyle w:val="BodyText"/>
+        <w:bidi w:val="0"/>
+        <w:spacing w:lineRule="auto" w:line="360"/>
+        <w:jc w:val="start"/>
+        <w:rPr/>
+      </w:pPr>
+      <w:r>
+        <w:rPr>
+          <w:rStyle w:val="Strong"/>
+        </w:rPr>
+        <w:t>Threshold Classification:</w:t>
+      </w:r>
+      <w:r>
+        <w:rPr/>
+        <w:t xml:space="preserve"> A decision threshold of 0.5 is applied to the computed probability score. If the probability is greater than or equal to 0.5, the review is classified as Positive sentiment. If the probability is less than 0.5, the review is classified as Negative sentiment. </w:t>
+      </w:r>
+    </w:p>
+    <w:p>
+      <w:pPr>
+        <w:pStyle w:val="BodyText"/>
+        <w:bidi w:val="0"/>
+        <w:spacing w:lineRule="auto" w:line="360"/>
+        <w:jc w:val="start"/>
+        <w:rPr/>
+      </w:pPr>
+      <w:r>
+        <w:rPr>
+          <w:rStyle w:val="Strong"/>
+        </w:rPr>
+        <w:t>Sentiment Label Assignment:</w:t>
+      </w:r>
+      <w:r>
+        <w:rPr/>
+        <w:t xml:space="preserve"> The classified sentiment label along with its probability score is stored in the database and displayed on the futsal center's profile page, providing users with an at-a-glance understanding of community satisfaction for each court. </w:t>
+      </w:r>
+    </w:p>
+    <w:p>
+      <w:pPr>
+        <w:pStyle w:val="BodyText"/>
+        <w:bidi w:val="0"/>
+        <w:spacing w:lineRule="auto" w:line="360"/>
+        <w:jc w:val="start"/>
+        <w:rPr/>
+      </w:pPr>
+      <w:r>
+        <w:rPr/>
+        <w:t>Mathematical Representation:</w:t>
+      </w:r>
+    </w:p>
+    <w:p>
+      <w:pPr>
+        <w:pStyle w:val="PreformattedText"/>
+        <w:bidi w:val="0"/>
+        <w:spacing w:lineRule="auto" w:line="360" w:before="0" w:after="283"/>
+        <w:ind w:hanging="0" w:start="0" w:end="0"/>
+        <w:jc w:val="start"/>
+        <w:rPr/>
+      </w:pPr>
+      <w:r>
+        <w:rPr>
+          <w:rStyle w:val="SourceText"/>
+          <w:rFonts w:ascii="var font-mono" w:hAnsi="var font-mono"/>
+          <w:color w:val="000000"/>
+          <w:shd w:fill="auto" w:val="clear"/>
+        </w:rPr>
+        <w:t>p = 1 / (1 + e^(−z))</w:t>
+      </w:r>
+    </w:p>
+    <w:p>
+      <w:pPr>
+        <w:pStyle w:val="BodyText"/>
+        <w:bidi w:val="0"/>
+        <w:spacing w:lineRule="auto" w:line="360"/>
+        <w:jc w:val="start"/>
+        <w:rPr/>
+      </w:pPr>
+      <w:r>
+        <w:rPr/>
+        <w:t>Where:</w:t>
+      </w:r>
+    </w:p>
+    <w:p>
+      <w:pPr>
+        <w:pStyle w:val="PreformattedText"/>
+        <w:bidi w:val="0"/>
+        <w:spacing w:lineRule="auto" w:line="360" w:before="0" w:after="283"/>
+        <w:ind w:hanging="0" w:start="0" w:end="0"/>
+        <w:jc w:val="start"/>
+        <w:rPr/>
+      </w:pPr>
+      <w:r>
+        <w:rPr>
+          <w:rStyle w:val="SourceText"/>
+          <w:rFonts w:ascii="var font-mono" w:hAnsi="var font-mono"/>
+          <w:color w:val="000000"/>
+          <w:shd w:fill="auto" w:val="clear"/>
+        </w:rPr>
+        <w:t>z = w₀ + w₁x₁ + w₂x₂ + … + wₙxₙ</w:t>
+      </w:r>
+    </w:p>
+    <w:p>
+      <w:pPr>
+        <w:pStyle w:val="BodyText"/>
+        <w:bidi w:val="0"/>
+        <w:spacing w:lineRule="auto" w:line="360"/>
+        <w:jc w:val="start"/>
+        <w:rPr/>
+      </w:pPr>
+      <w:r>
+        <w:rPr/>
+        <w:t>Decision Rule:</w:t>
+      </w:r>
+    </w:p>
+    <w:p>
+      <w:pPr>
+        <w:pStyle w:val="PreformattedText"/>
+        <w:bidi w:val="0"/>
+        <w:spacing w:lineRule="auto" w:line="360"/>
+        <w:ind w:hanging="0" w:start="0" w:end="0"/>
+        <w:jc w:val="start"/>
+        <w:rPr/>
+      </w:pPr>
+      <w:r>
+        <w:rPr>
+          <w:rStyle w:val="SourceText"/>
+          <w:rFonts w:ascii="var font-mono" w:hAnsi="var font-mono"/>
+          <w:color w:val="000000"/>
+          <w:shd w:fill="auto" w:val="clear"/>
+        </w:rPr>
+        <w:t>Sentiment = Positive   if p ≥ 0.5</w:t>
+      </w:r>
+    </w:p>
+    <w:p>
+      <w:pPr>
+        <w:pStyle w:val="PreformattedText"/>
+        <w:bidi w:val="0"/>
+        <w:spacing w:lineRule="auto" w:line="360" w:before="0" w:after="283"/>
+        <w:jc w:val="start"/>
+        <w:rPr/>
+      </w:pPr>
+      <w:r>
+        <w:rPr>
+          <w:rStyle w:val="SourceText"/>
+          <w:rFonts w:ascii="var font-mono" w:hAnsi="var font-mono"/>
+          <w:color w:val="000000"/>
+          <w:shd w:fill="auto" w:val="clear"/>
+        </w:rPr>
+        <w:t>Sentiment = Negative   if p &lt; 0.5</w:t>
+      </w:r>
+    </w:p>
+    <w:p>
+      <w:pPr>
+        <w:pStyle w:val="BodyText"/>
+        <w:bidi w:val="0"/>
+        <w:spacing w:lineRule="auto" w:line="360"/>
+        <w:jc w:val="start"/>
+        <w:rPr/>
+      </w:pPr>
+      <w:r>
+        <w:rPr/>
+        <w:t>Where:</w:t>
+      </w:r>
+    </w:p>
+    <w:p>
+      <w:pPr>
+        <w:pStyle w:val="BodyText"/>
+        <w:numPr>
+          <w:ilvl w:val="0"/>
+          <w:numId w:val="0"/>
+        </w:numPr>
+        <w:bidi w:val="0"/>
+        <w:spacing w:lineRule="auto" w:line="360" w:before="0" w:after="0"/>
+        <w:ind w:hanging="0" w:start="0"/>
+        <w:jc w:val="start"/>
+        <w:rPr/>
+      </w:pPr>
+      <w:r>
+        <w:rPr>
+          <w:rStyle w:val="Strong"/>
+          <w:b w:val="false"/>
+          <w:bCs w:val="false"/>
+        </w:rPr>
+        <w:t>p</w:t>
+      </w:r>
+      <w:r>
+        <w:rPr>
+          <w:b w:val="false"/>
+          <w:bCs w:val="false"/>
+        </w:rPr>
+        <w:t xml:space="preserve"> = Predicted probability of Positive sentiment </w:t>
+      </w:r>
+    </w:p>
+    <w:p>
+      <w:pPr>
+        <w:pStyle w:val="BodyText"/>
+        <w:numPr>
+          <w:ilvl w:val="0"/>
+          <w:numId w:val="0"/>
+        </w:numPr>
+        <w:bidi w:val="0"/>
+        <w:spacing w:lineRule="auto" w:line="360" w:before="0" w:after="0"/>
+        <w:ind w:hanging="0" w:start="0"/>
+        <w:jc w:val="start"/>
+        <w:rPr/>
+      </w:pPr>
+      <w:r>
+        <w:rPr>
+          <w:rStyle w:val="Strong"/>
+          <w:b w:val="false"/>
+          <w:bCs w:val="false"/>
+        </w:rPr>
+        <w:t>z</w:t>
+      </w:r>
+      <w:r>
+        <w:rPr>
+          <w:b w:val="false"/>
+          <w:bCs w:val="false"/>
+        </w:rPr>
+        <w:t xml:space="preserve"> = Linear combination of input features and learned weights </w:t>
+      </w:r>
+    </w:p>
+    <w:p>
+      <w:pPr>
+        <w:pStyle w:val="BodyText"/>
+        <w:numPr>
+          <w:ilvl w:val="0"/>
+          <w:numId w:val="0"/>
+        </w:numPr>
+        <w:bidi w:val="0"/>
+        <w:spacing w:lineRule="auto" w:line="360" w:before="0" w:after="0"/>
+        <w:ind w:hanging="0" w:start="0"/>
+        <w:jc w:val="start"/>
+        <w:rPr/>
+      </w:pPr>
+      <w:r>
+        <w:rPr>
+          <w:rStyle w:val="Strong"/>
+          <w:b w:val="false"/>
+          <w:bCs w:val="false"/>
+        </w:rPr>
+        <w:t>w₀</w:t>
+      </w:r>
+      <w:r>
+        <w:rPr>
+          <w:b w:val="false"/>
+          <w:bCs w:val="false"/>
+        </w:rPr>
+        <w:t xml:space="preserve"> = Bias term </w:t>
+      </w:r>
+    </w:p>
+    <w:p>
+      <w:pPr>
+        <w:pStyle w:val="BodyText"/>
+        <w:numPr>
+          <w:ilvl w:val="0"/>
+          <w:numId w:val="0"/>
+        </w:numPr>
+        <w:bidi w:val="0"/>
+        <w:spacing w:lineRule="auto" w:line="360" w:before="0" w:after="0"/>
+        <w:ind w:hanging="0" w:start="0"/>
+        <w:jc w:val="start"/>
+        <w:rPr/>
+      </w:pPr>
+      <w:r>
+        <w:rPr>
+          <w:rStyle w:val="Strong"/>
+          <w:b w:val="false"/>
+          <w:bCs w:val="false"/>
+        </w:rPr>
+        <w:t>w₁, w₂, …, wₙ</w:t>
+      </w:r>
+      <w:r>
+        <w:rPr>
+          <w:b w:val="false"/>
+          <w:bCs w:val="false"/>
+        </w:rPr>
+        <w:t xml:space="preserve"> = Learned weight coefficients for each TF-IDF feature </w:t>
+      </w:r>
+    </w:p>
+    <w:p>
+      <w:pPr>
+        <w:pStyle w:val="BodyText"/>
+        <w:numPr>
+          <w:ilvl w:val="0"/>
+          <w:numId w:val="0"/>
+        </w:numPr>
+        <w:bidi w:val="0"/>
+        <w:spacing w:lineRule="auto" w:line="360"/>
+        <w:ind w:hanging="0" w:start="0"/>
+        <w:jc w:val="start"/>
+        <w:rPr/>
+      </w:pPr>
+      <w:r>
+        <w:rPr>
+          <w:rStyle w:val="Strong"/>
+          <w:b w:val="false"/>
+          <w:bCs w:val="false"/>
+        </w:rPr>
+        <w:t>x₁, x₂, …, xₙ</w:t>
+      </w:r>
+      <w:r>
+        <w:rPr>
+          <w:b w:val="false"/>
+          <w:bCs w:val="false"/>
+        </w:rPr>
+        <w:t xml:space="preserve"> = TF-IDF feature values of the review </w:t>
+      </w:r>
+    </w:p>
+    <w:p>
+      <w:pPr>
+        <w:pStyle w:val="BodyText"/>
+        <w:bidi w:val="0"/>
+        <w:spacing w:lineRule="auto" w:line="360"/>
+        <w:jc w:val="start"/>
+        <w:rPr/>
+      </w:pPr>
+      <w:r>
+        <w:rPr/>
+      </w:r>
+    </w:p>
+    <w:p>
+      <w:pPr>
+        <w:pStyle w:val="BodyText"/>
+        <w:bidi w:val="0"/>
+        <w:spacing w:lineRule="auto" w:line="360"/>
+        <w:jc w:val="start"/>
+        <w:rPr/>
+      </w:pPr>
+      <w:r>
+        <w:rPr/>
+        <w:t xml:space="preserve">Furthermore, the integration of the Logistic Regression classifier with the TF-IDF feature extraction pipeline provides several additional advantages for the </w:t>
+      </w:r>
+      <w:r>
+        <w:rPr/>
+        <w:t>futsal bookings and management</w:t>
+      </w:r>
+      <w:r>
+        <w:rPr/>
+        <w:t xml:space="preserve"> platform:</w:t>
+      </w:r>
+    </w:p>
+    <w:p>
+      <w:pPr>
+        <w:pStyle w:val="BodyText"/>
+        <w:numPr>
+          <w:ilvl w:val="0"/>
+          <w:numId w:val="9"/>
+        </w:numPr>
+        <w:tabs>
+          <w:tab w:val="clear" w:pos="709"/>
+          <w:tab w:val="left" w:pos="709" w:leader="none"/>
+        </w:tabs>
+        <w:bidi w:val="0"/>
+        <w:spacing w:lineRule="auto" w:line="360" w:before="0" w:after="0"/>
+        <w:ind w:hanging="283" w:start="709"/>
+        <w:jc w:val="start"/>
+        <w:rPr/>
+      </w:pPr>
+      <w:r>
+        <w:rPr/>
+        <w:t xml:space="preserve">Users and futsal owners receive automatically generated sentiment summaries for each court, reducing the need to manually read through hundreds of reviews. </w:t>
+      </w:r>
+    </w:p>
+    <w:p>
+      <w:pPr>
+        <w:pStyle w:val="BodyText"/>
+        <w:numPr>
+          <w:ilvl w:val="0"/>
+          <w:numId w:val="9"/>
+        </w:numPr>
+        <w:tabs>
+          <w:tab w:val="clear" w:pos="709"/>
+          <w:tab w:val="left" w:pos="709" w:leader="none"/>
+        </w:tabs>
+        <w:bidi w:val="0"/>
+        <w:spacing w:lineRule="auto" w:line="360" w:before="0" w:after="0"/>
+        <w:ind w:hanging="283" w:start="709"/>
+        <w:jc w:val="start"/>
+        <w:rPr/>
+      </w:pPr>
+      <w:r>
+        <w:rPr/>
+        <w:t xml:space="preserve">The sentiment score is stored alongside each review record, enabling trend analysis of customer satisfaction over time. </w:t>
+      </w:r>
+    </w:p>
+    <w:p>
+      <w:pPr>
+        <w:pStyle w:val="BodyText"/>
+        <w:numPr>
+          <w:ilvl w:val="0"/>
+          <w:numId w:val="9"/>
+        </w:numPr>
+        <w:tabs>
+          <w:tab w:val="clear" w:pos="709"/>
+          <w:tab w:val="left" w:pos="709" w:leader="none"/>
+        </w:tabs>
+        <w:bidi w:val="0"/>
+        <w:spacing w:lineRule="auto" w:line="360" w:before="0" w:after="0"/>
+        <w:ind w:hanging="283" w:start="709"/>
+        <w:jc w:val="start"/>
+        <w:rPr/>
+      </w:pPr>
+      <w:r>
+        <w:rPr/>
+        <w:t xml:space="preserve">Historical review data and sentiment patterns are used to improve court recommendations, ensuring that highly rated and positively reviewed courts are surfaced more prominently to users. </w:t>
+      </w:r>
+    </w:p>
+    <w:p>
+      <w:pPr>
+        <w:pStyle w:val="BodyText"/>
+        <w:numPr>
+          <w:ilvl w:val="0"/>
+          <w:numId w:val="9"/>
+        </w:numPr>
+        <w:tabs>
+          <w:tab w:val="clear" w:pos="709"/>
+          <w:tab w:val="left" w:pos="709" w:leader="none"/>
+        </w:tabs>
+        <w:bidi w:val="0"/>
+        <w:spacing w:lineRule="auto" w:line="360" w:before="0" w:after="0"/>
+        <w:ind w:hanging="283" w:start="709"/>
+        <w:jc w:val="start"/>
+        <w:rPr/>
+      </w:pPr>
+      <w:r>
+        <w:rPr/>
+        <w:t xml:space="preserve">Automation of review analysis significantly reduces administrative effort, allowing platform administrators to focus on moderation and platform improvement. </w:t>
+      </w:r>
+    </w:p>
+    <w:p>
+      <w:pPr>
+        <w:pStyle w:val="BodyText"/>
+        <w:numPr>
+          <w:ilvl w:val="0"/>
+          <w:numId w:val="9"/>
+        </w:numPr>
+        <w:tabs>
+          <w:tab w:val="clear" w:pos="709"/>
+          <w:tab w:val="left" w:pos="709" w:leader="none"/>
+        </w:tabs>
+        <w:bidi w:val="0"/>
+        <w:spacing w:lineRule="auto" w:line="360"/>
+        <w:ind w:hanging="283" w:start="709"/>
+        <w:jc w:val="start"/>
+        <w:rPr/>
+      </w:pPr>
+      <w:r>
+        <w:rPr/>
+        <w:t xml:space="preserve">By relying on a structured machine learning algorithm rather than subjective manual assessment, the system enhances trust and transparency in the review system for both players and futsal owners. </w:t>
+      </w:r>
+    </w:p>
+    <w:p>
+      <w:pPr>
+        <w:pStyle w:val="BodyText"/>
+        <w:bidi w:val="0"/>
+        <w:spacing w:lineRule="auto" w:line="360"/>
+        <w:jc w:val="start"/>
+        <w:rPr/>
+      </w:pPr>
+      <w:r>
+        <w:rPr/>
+        <w:t xml:space="preserve">Overall, the combination of the Slot Conflict Prevention Algorithm, the Haversine Location Distance Algorithm and the Logistic Regression Sentiment Classification Algorithm provides the </w:t>
+      </w:r>
+      <w:r>
+        <w:rPr/>
+        <w:t>futsal bookings and management</w:t>
+      </w:r>
+      <w:r>
+        <w:rPr/>
+        <w:t xml:space="preserve"> platform with a robust, intelligent, and efficient foundation for managing bookings, recommending courts, and analyzing user feedback in a fair, automated, and data-driven manner.</w:t>
+      </w:r>
+    </w:p>
+    <w:p>
+      <w:pPr>
+        <w:pStyle w:val="Normal"/>
+        <w:bidi w:val="0"/>
+        <w:spacing w:lineRule="auto" w:line="360" w:before="57" w:after="57"/>
+        <w:jc w:val="start"/>
+        <w:rPr>
+          <w:rFonts w:ascii="Times New Roman" w:hAnsi="Times New Roman"/>
+          <w:b w:val="false"/>
+          <w:bCs w:val="false"/>
+          <w:sz w:val="24"/>
+          <w:szCs w:val="24"/>
+        </w:rPr>
+      </w:pPr>
+      <w:r>
+        <w:rPr>
+          <w:rFonts w:ascii="Times New Roman" w:hAnsi="Times New Roman"/>
+          <w:b w:val="false"/>
+          <w:bCs w:val="false"/>
+          <w:sz w:val="24"/>
+          <w:szCs w:val="24"/>
+        </w:rPr>
+      </w:r>
       <w:r>
         <w:br w:type="page"/>
+      </w:r>
+    </w:p>
+    <w:p>
+      <w:pPr>
+        <w:pStyle w:val="Normal"/>
+        <w:bidi w:val="0"/>
+        <w:spacing w:lineRule="auto" w:line="480" w:before="57" w:after="57"/>
+        <w:jc w:val="center"/>
+        <w:rPr>
+          <w:rFonts w:ascii="Times New Roman" w:hAnsi="Times New Roman"/>
+          <w:b w:val="false"/>
+          <w:bCs w:val="false"/>
+          <w:sz w:val="24"/>
+          <w:szCs w:val="24"/>
+        </w:rPr>
+      </w:pPr>
+      <w:r>
+        <w:rPr>
+          <w:rFonts w:ascii="Times New Roman" w:hAnsi="Times New Roman"/>
+          <w:b/>
+          <w:bCs/>
+          <w:sz w:val="24"/>
+          <w:szCs w:val="24"/>
+        </w:rPr>
+        <w:t>CHAPTER FIVE:</w:t>
+      </w:r>
+    </w:p>
+    <w:p>
+      <w:pPr>
+        <w:pStyle w:val="Normal"/>
+        <w:bidi w:val="0"/>
+        <w:spacing w:lineRule="auto" w:line="480" w:before="57" w:after="57"/>
+        <w:jc w:val="center"/>
+        <w:rPr>
+          <w:rFonts w:ascii="Times New Roman" w:hAnsi="Times New Roman"/>
+          <w:b w:val="false"/>
+          <w:bCs w:val="false"/>
+          <w:sz w:val="24"/>
+          <w:szCs w:val="24"/>
+        </w:rPr>
+      </w:pPr>
+      <w:r>
+        <w:rPr>
+          <w:rFonts w:ascii="Times New Roman" w:hAnsi="Times New Roman"/>
+          <w:b/>
+          <w:bCs/>
+          <w:sz w:val="24"/>
+          <w:szCs w:val="24"/>
+        </w:rPr>
+        <w:t>IMPLEMENTATION AND TESTING</w:t>
       </w:r>
     </w:p>
     <w:p>
@@ -9952,18 +11076,22 @@
         <w:spacing w:lineRule="auto" w:line="480" w:before="57" w:after="57"/>
         <w:jc w:val="start"/>
         <w:rPr>
-          <w:b/>
-          <w:bCs/>
-        </w:rPr>
-      </w:pPr>
-      <w:r>
-        <w:rPr>
-          <w:rFonts w:ascii="Times New Roman" w:hAnsi="Times New Roman"/>
-          <w:b w:val="false"/>
-          <w:bCs w:val="false"/>
-          <w:sz w:val="24"/>
-          <w:szCs w:val="24"/>
-        </w:rPr>
+          <w:rFonts w:ascii="Times New Roman" w:hAnsi="Times New Roman"/>
+          <w:b w:val="false"/>
+          <w:bCs w:val="false"/>
+          <w:sz w:val="24"/>
+          <w:szCs w:val="24"/>
+        </w:rPr>
+      </w:pPr>
+      <w:r>
+        <w:rPr>
+          <w:rFonts w:ascii="Times New Roman" w:hAnsi="Times New Roman"/>
+          <w:b/>
+          <w:bCs/>
+          <w:sz w:val="24"/>
+          <w:szCs w:val="24"/>
+        </w:rPr>
+        <w:t>5.1 Implementation</w:t>
       </w:r>
       <w:r>
         <w:br w:type="page"/>
@@ -10324,7 +11452,7 @@
     </w:r>
     <w:r>
       <w:rPr/>
-      <w:t>28</w:t>
+      <w:t>31</w:t>
     </w:r>
     <w:r>
       <w:rPr/>
@@ -11004,6 +12132,417 @@
     </w:lvl>
   </w:abstractNum>
   <w:abstractNum w:abstractNumId="6">
+    <w:lvl w:ilvl="0">
+      <w:start w:val="1"/>
+      <w:numFmt w:val="bullet"/>
+      <w:lvlText w:val=""/>
+      <w:lvlJc w:val="start"/>
+      <w:pPr>
+        <w:tabs>
+          <w:tab w:val="num" w:pos="709"/>
+        </w:tabs>
+        <w:ind w:start="709" w:hanging="283"/>
+      </w:pPr>
+      <w:rPr>
+        <w:rFonts w:ascii="Symbol" w:hAnsi="Symbol" w:cs="Symbol" w:hint="default"/>
+      </w:rPr>
+    </w:lvl>
+    <w:lvl w:ilvl="1">
+      <w:start w:val="1"/>
+      <w:numFmt w:val="bullet"/>
+      <w:lvlText w:val=""/>
+      <w:lvlJc w:val="start"/>
+      <w:pPr>
+        <w:tabs>
+          <w:tab w:val="num" w:pos="1418"/>
+        </w:tabs>
+        <w:ind w:start="1418" w:hanging="283"/>
+      </w:pPr>
+      <w:rPr>
+        <w:rFonts w:ascii="Symbol" w:hAnsi="Symbol" w:cs="Symbol" w:hint="default"/>
+      </w:rPr>
+    </w:lvl>
+    <w:lvl w:ilvl="2">
+      <w:start w:val="1"/>
+      <w:numFmt w:val="bullet"/>
+      <w:lvlText w:val=""/>
+      <w:lvlJc w:val="start"/>
+      <w:pPr>
+        <w:tabs>
+          <w:tab w:val="num" w:pos="2127"/>
+        </w:tabs>
+        <w:ind w:start="2127" w:hanging="283"/>
+      </w:pPr>
+      <w:rPr>
+        <w:rFonts w:ascii="Symbol" w:hAnsi="Symbol" w:cs="Symbol" w:hint="default"/>
+      </w:rPr>
+    </w:lvl>
+    <w:lvl w:ilvl="3">
+      <w:start w:val="1"/>
+      <w:numFmt w:val="bullet"/>
+      <w:lvlText w:val=""/>
+      <w:lvlJc w:val="start"/>
+      <w:pPr>
+        <w:tabs>
+          <w:tab w:val="num" w:pos="2836"/>
+        </w:tabs>
+        <w:ind w:start="2836" w:hanging="283"/>
+      </w:pPr>
+      <w:rPr>
+        <w:rFonts w:ascii="Symbol" w:hAnsi="Symbol" w:cs="Symbol" w:hint="default"/>
+      </w:rPr>
+    </w:lvl>
+    <w:lvl w:ilvl="4">
+      <w:start w:val="1"/>
+      <w:numFmt w:val="bullet"/>
+      <w:lvlText w:val=""/>
+      <w:lvlJc w:val="start"/>
+      <w:pPr>
+        <w:tabs>
+          <w:tab w:val="num" w:pos="3545"/>
+        </w:tabs>
+        <w:ind w:start="3545" w:hanging="283"/>
+      </w:pPr>
+      <w:rPr>
+        <w:rFonts w:ascii="Symbol" w:hAnsi="Symbol" w:cs="Symbol" w:hint="default"/>
+      </w:rPr>
+    </w:lvl>
+    <w:lvl w:ilvl="5">
+      <w:start w:val="1"/>
+      <w:numFmt w:val="bullet"/>
+      <w:lvlText w:val=""/>
+      <w:lvlJc w:val="start"/>
+      <w:pPr>
+        <w:tabs>
+          <w:tab w:val="num" w:pos="4254"/>
+        </w:tabs>
+        <w:ind w:start="4254" w:hanging="283"/>
+      </w:pPr>
+      <w:rPr>
+        <w:rFonts w:ascii="Symbol" w:hAnsi="Symbol" w:cs="Symbol" w:hint="default"/>
+      </w:rPr>
+    </w:lvl>
+    <w:lvl w:ilvl="6">
+      <w:start w:val="1"/>
+      <w:numFmt w:val="bullet"/>
+      <w:lvlText w:val=""/>
+      <w:lvlJc w:val="start"/>
+      <w:pPr>
+        <w:tabs>
+          <w:tab w:val="num" w:pos="4963"/>
+        </w:tabs>
+        <w:ind w:start="4963" w:hanging="283"/>
+      </w:pPr>
+      <w:rPr>
+        <w:rFonts w:ascii="Symbol" w:hAnsi="Symbol" w:cs="Symbol" w:hint="default"/>
+      </w:rPr>
+    </w:lvl>
+    <w:lvl w:ilvl="7">
+      <w:start w:val="1"/>
+      <w:numFmt w:val="bullet"/>
+      <w:lvlText w:val=""/>
+      <w:lvlJc w:val="start"/>
+      <w:pPr>
+        <w:tabs>
+          <w:tab w:val="num" w:pos="5672"/>
+        </w:tabs>
+        <w:ind w:start="5672" w:hanging="283"/>
+      </w:pPr>
+      <w:rPr>
+        <w:rFonts w:ascii="Symbol" w:hAnsi="Symbol" w:cs="Symbol" w:hint="default"/>
+      </w:rPr>
+    </w:lvl>
+    <w:lvl w:ilvl="8">
+      <w:start w:val="1"/>
+      <w:numFmt w:val="bullet"/>
+      <w:lvlText w:val=""/>
+      <w:lvlJc w:val="start"/>
+      <w:pPr>
+        <w:tabs>
+          <w:tab w:val="num" w:pos="6381"/>
+        </w:tabs>
+        <w:ind w:start="6381" w:hanging="283"/>
+      </w:pPr>
+      <w:rPr>
+        <w:rFonts w:ascii="Symbol" w:hAnsi="Symbol" w:cs="Symbol" w:hint="default"/>
+      </w:rPr>
+    </w:lvl>
+  </w:abstractNum>
+  <w:abstractNum w:abstractNumId="7">
+    <w:lvl w:ilvl="0">
+      <w:start w:val="1"/>
+      <w:numFmt w:val="bullet"/>
+      <w:lvlText w:val=""/>
+      <w:lvlJc w:val="start"/>
+      <w:pPr>
+        <w:tabs>
+          <w:tab w:val="num" w:pos="709"/>
+        </w:tabs>
+        <w:ind w:start="709" w:hanging="283"/>
+      </w:pPr>
+      <w:rPr>
+        <w:rFonts w:ascii="Symbol" w:hAnsi="Symbol" w:cs="Symbol" w:hint="default"/>
+      </w:rPr>
+    </w:lvl>
+    <w:lvl w:ilvl="1">
+      <w:start w:val="1"/>
+      <w:numFmt w:val="bullet"/>
+      <w:lvlText w:val=""/>
+      <w:lvlJc w:val="start"/>
+      <w:pPr>
+        <w:tabs>
+          <w:tab w:val="num" w:pos="1418"/>
+        </w:tabs>
+        <w:ind w:start="1418" w:hanging="283"/>
+      </w:pPr>
+      <w:rPr>
+        <w:rFonts w:ascii="Symbol" w:hAnsi="Symbol" w:cs="Symbol" w:hint="default"/>
+      </w:rPr>
+    </w:lvl>
+    <w:lvl w:ilvl="2">
+      <w:start w:val="1"/>
+      <w:numFmt w:val="bullet"/>
+      <w:lvlText w:val=""/>
+      <w:lvlJc w:val="start"/>
+      <w:pPr>
+        <w:tabs>
+          <w:tab w:val="num" w:pos="2127"/>
+        </w:tabs>
+        <w:ind w:start="2127" w:hanging="283"/>
+      </w:pPr>
+      <w:rPr>
+        <w:rFonts w:ascii="Symbol" w:hAnsi="Symbol" w:cs="Symbol" w:hint="default"/>
+      </w:rPr>
+    </w:lvl>
+    <w:lvl w:ilvl="3">
+      <w:start w:val="1"/>
+      <w:numFmt w:val="bullet"/>
+      <w:lvlText w:val=""/>
+      <w:lvlJc w:val="start"/>
+      <w:pPr>
+        <w:tabs>
+          <w:tab w:val="num" w:pos="2836"/>
+        </w:tabs>
+        <w:ind w:start="2836" w:hanging="283"/>
+      </w:pPr>
+      <w:rPr>
+        <w:rFonts w:ascii="Symbol" w:hAnsi="Symbol" w:cs="Symbol" w:hint="default"/>
+      </w:rPr>
+    </w:lvl>
+    <w:lvl w:ilvl="4">
+      <w:start w:val="1"/>
+      <w:numFmt w:val="bullet"/>
+      <w:lvlText w:val=""/>
+      <w:lvlJc w:val="start"/>
+      <w:pPr>
+        <w:tabs>
+          <w:tab w:val="num" w:pos="3545"/>
+        </w:tabs>
+        <w:ind w:start="3545" w:hanging="283"/>
+      </w:pPr>
+      <w:rPr>
+        <w:rFonts w:ascii="Symbol" w:hAnsi="Symbol" w:cs="Symbol" w:hint="default"/>
+      </w:rPr>
+    </w:lvl>
+    <w:lvl w:ilvl="5">
+      <w:start w:val="1"/>
+      <w:numFmt w:val="bullet"/>
+      <w:lvlText w:val=""/>
+      <w:lvlJc w:val="start"/>
+      <w:pPr>
+        <w:tabs>
+          <w:tab w:val="num" w:pos="4254"/>
+        </w:tabs>
+        <w:ind w:start="4254" w:hanging="283"/>
+      </w:pPr>
+      <w:rPr>
+        <w:rFonts w:ascii="Symbol" w:hAnsi="Symbol" w:cs="Symbol" w:hint="default"/>
+      </w:rPr>
+    </w:lvl>
+    <w:lvl w:ilvl="6">
+      <w:start w:val="1"/>
+      <w:numFmt w:val="bullet"/>
+      <w:lvlText w:val=""/>
+      <w:lvlJc w:val="start"/>
+      <w:pPr>
+        <w:tabs>
+          <w:tab w:val="num" w:pos="4963"/>
+        </w:tabs>
+        <w:ind w:start="4963" w:hanging="283"/>
+      </w:pPr>
+      <w:rPr>
+        <w:rFonts w:ascii="Symbol" w:hAnsi="Symbol" w:cs="Symbol" w:hint="default"/>
+      </w:rPr>
+    </w:lvl>
+    <w:lvl w:ilvl="7">
+      <w:start w:val="1"/>
+      <w:numFmt w:val="bullet"/>
+      <w:lvlText w:val=""/>
+      <w:lvlJc w:val="start"/>
+      <w:pPr>
+        <w:tabs>
+          <w:tab w:val="num" w:pos="5672"/>
+        </w:tabs>
+        <w:ind w:start="5672" w:hanging="283"/>
+      </w:pPr>
+      <w:rPr>
+        <w:rFonts w:ascii="Symbol" w:hAnsi="Symbol" w:cs="Symbol" w:hint="default"/>
+      </w:rPr>
+    </w:lvl>
+    <w:lvl w:ilvl="8">
+      <w:start w:val="1"/>
+      <w:numFmt w:val="bullet"/>
+      <w:lvlText w:val=""/>
+      <w:lvlJc w:val="start"/>
+      <w:pPr>
+        <w:tabs>
+          <w:tab w:val="num" w:pos="6381"/>
+        </w:tabs>
+        <w:ind w:start="6381" w:hanging="283"/>
+      </w:pPr>
+      <w:rPr>
+        <w:rFonts w:ascii="Symbol" w:hAnsi="Symbol" w:cs="Symbol" w:hint="default"/>
+      </w:rPr>
+    </w:lvl>
+  </w:abstractNum>
+  <w:abstractNum w:abstractNumId="8">
+    <w:lvl w:ilvl="0">
+      <w:start w:val="1"/>
+      <w:numFmt w:val="bullet"/>
+      <w:lvlText w:val=""/>
+      <w:lvlJc w:val="start"/>
+      <w:pPr>
+        <w:tabs>
+          <w:tab w:val="num" w:pos="709"/>
+        </w:tabs>
+        <w:ind w:start="709" w:hanging="283"/>
+      </w:pPr>
+      <w:rPr>
+        <w:rFonts w:ascii="Symbol" w:hAnsi="Symbol" w:cs="Symbol" w:hint="default"/>
+      </w:rPr>
+    </w:lvl>
+    <w:lvl w:ilvl="1">
+      <w:start w:val="1"/>
+      <w:numFmt w:val="bullet"/>
+      <w:lvlText w:val=""/>
+      <w:lvlJc w:val="start"/>
+      <w:pPr>
+        <w:tabs>
+          <w:tab w:val="num" w:pos="1418"/>
+        </w:tabs>
+        <w:ind w:start="1418" w:hanging="283"/>
+      </w:pPr>
+      <w:rPr>
+        <w:rFonts w:ascii="Symbol" w:hAnsi="Symbol" w:cs="Symbol" w:hint="default"/>
+      </w:rPr>
+    </w:lvl>
+    <w:lvl w:ilvl="2">
+      <w:start w:val="1"/>
+      <w:numFmt w:val="bullet"/>
+      <w:lvlText w:val=""/>
+      <w:lvlJc w:val="start"/>
+      <w:pPr>
+        <w:tabs>
+          <w:tab w:val="num" w:pos="2127"/>
+        </w:tabs>
+        <w:ind w:start="2127" w:hanging="283"/>
+      </w:pPr>
+      <w:rPr>
+        <w:rFonts w:ascii="Symbol" w:hAnsi="Symbol" w:cs="Symbol" w:hint="default"/>
+      </w:rPr>
+    </w:lvl>
+    <w:lvl w:ilvl="3">
+      <w:start w:val="1"/>
+      <w:numFmt w:val="bullet"/>
+      <w:lvlText w:val=""/>
+      <w:lvlJc w:val="start"/>
+      <w:pPr>
+        <w:tabs>
+          <w:tab w:val="num" w:pos="2836"/>
+        </w:tabs>
+        <w:ind w:start="2836" w:hanging="283"/>
+      </w:pPr>
+      <w:rPr>
+        <w:rFonts w:ascii="Symbol" w:hAnsi="Symbol" w:cs="Symbol" w:hint="default"/>
+      </w:rPr>
+    </w:lvl>
+    <w:lvl w:ilvl="4">
+      <w:start w:val="1"/>
+      <w:numFmt w:val="bullet"/>
+      <w:lvlText w:val=""/>
+      <w:lvlJc w:val="start"/>
+      <w:pPr>
+        <w:tabs>
+          <w:tab w:val="num" w:pos="3545"/>
+        </w:tabs>
+        <w:ind w:start="3545" w:hanging="283"/>
+      </w:pPr>
+      <w:rPr>
+        <w:rFonts w:ascii="Symbol" w:hAnsi="Symbol" w:cs="Symbol" w:hint="default"/>
+      </w:rPr>
+    </w:lvl>
+    <w:lvl w:ilvl="5">
+      <w:start w:val="1"/>
+      <w:numFmt w:val="bullet"/>
+      <w:lvlText w:val=""/>
+      <w:lvlJc w:val="start"/>
+      <w:pPr>
+        <w:tabs>
+          <w:tab w:val="num" w:pos="4254"/>
+        </w:tabs>
+        <w:ind w:start="4254" w:hanging="283"/>
+      </w:pPr>
+      <w:rPr>
+        <w:rFonts w:ascii="Symbol" w:hAnsi="Symbol" w:cs="Symbol" w:hint="default"/>
+      </w:rPr>
+    </w:lvl>
+    <w:lvl w:ilvl="6">
+      <w:start w:val="1"/>
+      <w:numFmt w:val="bullet"/>
+      <w:lvlText w:val=""/>
+      <w:lvlJc w:val="start"/>
+      <w:pPr>
+        <w:tabs>
+          <w:tab w:val="num" w:pos="4963"/>
+        </w:tabs>
+        <w:ind w:start="4963" w:hanging="283"/>
+      </w:pPr>
+      <w:rPr>
+        <w:rFonts w:ascii="Symbol" w:hAnsi="Symbol" w:cs="Symbol" w:hint="default"/>
+      </w:rPr>
+    </w:lvl>
+    <w:lvl w:ilvl="7">
+      <w:start w:val="1"/>
+      <w:numFmt w:val="bullet"/>
+      <w:lvlText w:val=""/>
+      <w:lvlJc w:val="start"/>
+      <w:pPr>
+        <w:tabs>
+          <w:tab w:val="num" w:pos="5672"/>
+        </w:tabs>
+        <w:ind w:start="5672" w:hanging="283"/>
+      </w:pPr>
+      <w:rPr>
+        <w:rFonts w:ascii="Symbol" w:hAnsi="Symbol" w:cs="Symbol" w:hint="default"/>
+      </w:rPr>
+    </w:lvl>
+    <w:lvl w:ilvl="8">
+      <w:start w:val="1"/>
+      <w:numFmt w:val="bullet"/>
+      <w:lvlText w:val=""/>
+      <w:lvlJc w:val="start"/>
+      <w:pPr>
+        <w:tabs>
+          <w:tab w:val="num" w:pos="6381"/>
+        </w:tabs>
+        <w:ind w:start="6381" w:hanging="283"/>
+      </w:pPr>
+      <w:rPr>
+        <w:rFonts w:ascii="Symbol" w:hAnsi="Symbol" w:cs="Symbol" w:hint="default"/>
+      </w:rPr>
+    </w:lvl>
+  </w:abstractNum>
+  <w:abstractNum w:abstractNumId="9">
     <w:lvl w:ilvl="0">
       <w:start w:val="1"/>
       <w:numFmt w:val="bullet"/>
@@ -11157,6 +12696,15 @@
   </w:num>
   <w:num w:numId="6">
     <w:abstractNumId w:val="6"/>
+  </w:num>
+  <w:num w:numId="7">
+    <w:abstractNumId w:val="7"/>
+  </w:num>
+  <w:num w:numId="8">
+    <w:abstractNumId w:val="8"/>
+  </w:num>
+  <w:num w:numId="9">
+    <w:abstractNumId w:val="9"/>
   </w:num>
 </w:numbering>
 </file>
@@ -11386,6 +12934,19 @@
       <w:bCs/>
     </w:rPr>
   </w:style>
+  <w:style w:type="paragraph" w:styleId="PreformattedText">
+    <w:name w:val="Preformatted Text"/>
+    <w:basedOn w:val="Normal"/>
+    <w:qFormat/>
+    <w:pPr>
+      <w:spacing w:before="0" w:after="0"/>
+    </w:pPr>
+    <w:rPr>
+      <w:rFonts w:ascii="Liberation Mono" w:hAnsi="Liberation Mono" w:eastAsia="Noto Sans Mono CJK SC" w:cs="Liberation Mono"/>
+      <w:sz w:val="20"/>
+      <w:szCs w:val="20"/>
+    </w:rPr>
+  </w:style>
   <w:style w:type="numbering" w:styleId="Bullet">
     <w:name w:val="Bullet •"/>
     <w:qFormat/>

</xml_diff>

<commit_message>
update: forum and payment test
</commit_message>
<xml_diff>
--- a/documents/report/report1.docx
+++ b/documents/report/report1.docx
@@ -21291,7 +21291,11 @@
       </w:pPr>
       <w:r>
         <w:rPr/>
-        <w:t>While the AllFutsal platform already provides a comprehensive and efficient environment for futsal court booking and management, there are several opportunities for future improvements to further enhance user experience, accessibility, platform capabilities, and business growth.</w:t>
+        <w:t>T</w:t>
+      </w:r>
+      <w:r>
+        <w:rPr/>
+        <w:t>here are several opportunities for future improvements to further enhance user experience, accessibility, platform capabilities, and business growth.</w:t>
       </w:r>
     </w:p>
     <w:p>
@@ -21844,7 +21848,7 @@
     </w:r>
     <w:r>
       <w:rPr/>
-      <w:t>54</w:t>
+      <w:t>48</w:t>
     </w:r>
     <w:r>
       <w:rPr/>

</xml_diff>